<commit_message>
penyesuaian:format preview rental dokumen|fee admin payment
</commit_message>
<xml_diff>
--- a/templates/template.docx
+++ b/templates/template.docx
@@ -1765,7 +1765,14 @@
           <w:color w:val="000008"/>
           <w:spacing w:val="-2"/>
         </w:rPr>
-        <w:t>Warga Perhari</w:t>
+        <w:t>H</w:t>
+      </w:r>
+      <w:r>
+        <w:rPr>
+          <w:color w:val="000008"/>
+          <w:spacing w:val="-2"/>
+        </w:rPr>
+        <w:t>arga Perhari</w:t>
       </w:r>
       <w:r>
         <w:rPr>
@@ -3983,34 +3990,59 @@
         <w:rPr>
           <w:rFonts w:ascii="Arial"/>
           <w:b/>
-        </w:rPr>
-      </w:pPr>
-      <w:r>
+          <w:color w:val="000008"/>
+        </w:rPr>
+      </w:pPr>
+    </w:p>
+    <w:p>
+      <w:pPr>
+        <w:ind w:left="23"/>
         <w:rPr>
           <w:rFonts w:ascii="Arial"/>
           <w:b/>
           <w:color w:val="000008"/>
         </w:rPr>
-        <w:t>Ayat</w:t>
-      </w:r>
-      <w:r>
+      </w:pPr>
+    </w:p>
+    <w:p>
+      <w:pPr>
+        <w:ind w:left="23"/>
         <w:rPr>
           <w:rFonts w:ascii="Arial"/>
           <w:b/>
           <w:color w:val="000008"/>
-          <w:spacing w:val="-1"/>
-        </w:rPr>
-        <w:t xml:space="preserve"> </w:t>
-      </w:r>
-      <w:r>
+        </w:rPr>
+      </w:pPr>
+    </w:p>
+    <w:p>
+      <w:pPr>
+        <w:ind w:left="23"/>
         <w:rPr>
           <w:rFonts w:ascii="Arial"/>
           <w:b/>
           <w:color w:val="000008"/>
-          <w:spacing w:val="-10"/>
-        </w:rPr>
-        <w:t>1</w:t>
-      </w:r>
+        </w:rPr>
+      </w:pPr>
+    </w:p>
+    <w:p>
+      <w:pPr>
+        <w:ind w:left="23"/>
+        <w:rPr>
+          <w:rFonts w:ascii="Arial"/>
+          <w:b/>
+          <w:color w:val="000008"/>
+        </w:rPr>
+      </w:pPr>
+    </w:p>
+    <w:p>
+      <w:pPr>
+        <w:ind w:left="23"/>
+        <w:rPr>
+          <w:rFonts w:ascii="Arial"/>
+          <w:b/>
+          <w:color w:val="000008"/>
+        </w:rPr>
+      </w:pPr>
     </w:p>
     <w:p>
       <w:pPr>
@@ -4039,13 +4071,7 @@
         <w:rPr>
           <w:color w:val="000008"/>
         </w:rPr>
-        <w:t>PA</w:t>
-      </w:r>
-      <w:r>
-        <w:rPr>
-          <w:color w:val="000008"/>
-        </w:rPr>
-        <w:t>SAL</w:t>
+        <w:t>PASAL</w:t>
       </w:r>
       <w:r>
         <w:rPr>
@@ -4142,6 +4168,41 @@
           <w:docGrid w:linePitch="299"/>
         </w:sectPr>
       </w:pPr>
+    </w:p>
+    <w:p>
+      <w:pPr>
+        <w:ind w:left="23"/>
+        <w:rPr>
+          <w:rFonts w:ascii="Arial"/>
+          <w:b/>
+        </w:rPr>
+      </w:pPr>
+      <w:r>
+        <w:rPr>
+          <w:rFonts w:ascii="Arial"/>
+          <w:b/>
+          <w:color w:val="000008"/>
+        </w:rPr>
+        <w:t>Ayat</w:t>
+      </w:r>
+      <w:r>
+        <w:rPr>
+          <w:rFonts w:ascii="Arial"/>
+          <w:b/>
+          <w:color w:val="000008"/>
+          <w:spacing w:val="-1"/>
+        </w:rPr>
+        <w:t xml:space="preserve"> </w:t>
+      </w:r>
+      <w:r>
+        <w:rPr>
+          <w:rFonts w:ascii="Arial"/>
+          <w:b/>
+          <w:color w:val="000008"/>
+          <w:spacing w:val="-10"/>
+        </w:rPr>
+        <w:t>1</w:t>
+      </w:r>
     </w:p>
     <w:p>
       <w:pPr>
@@ -5604,7 +5665,6 @@
         <w:rPr>
           <w:color w:val="000008"/>
         </w:rPr>
-        <w:lastRenderedPageBreak/>
         <w:t>Ayat</w:t>
       </w:r>
       <w:r>
@@ -6933,7 +6993,15 @@
           <w:color w:val="000008"/>
           <w:spacing w:val="-2"/>
         </w:rPr>
-        <w:t>11 PENUTUP</w:t>
+        <w:t xml:space="preserve">11 </w:t>
+      </w:r>
+      <w:r>
+        <w:rPr>
+          <w:color w:val="000008"/>
+          <w:spacing w:val="-2"/>
+        </w:rPr>
+        <w:lastRenderedPageBreak/>
+        <w:t>PENUTUP</w:t>
       </w:r>
     </w:p>
     <w:p>
@@ -7759,7 +7827,7 @@
         </mc:Choice>
         <mc:Fallback>
           <w:pict>
-            <v:line w14:anchorId="411531AF" id="Straight Connector 6" o:spid="_x0000_s1026" style="position:absolute;z-index:487498240;visibility:visible;mso-wrap-style:square;mso-wrap-distance-left:9pt;mso-wrap-distance-top:0;mso-wrap-distance-right:9pt;mso-wrap-distance-bottom:0;mso-position-horizontal:absolute;mso-position-horizontal-relative:text;mso-position-vertical:absolute;mso-position-vertical-relative:text" from="-70.1pt,.05pt" to="523.9pt,.05pt" o:gfxdata="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" strokecolor="black [3213]" strokeweight="1.5pt"/>
+            <v:line w14:anchorId="7AEF0F4D" id="Straight Connector 6" o:spid="_x0000_s1026" style="position:absolute;z-index:487498240;visibility:visible;mso-wrap-style:square;mso-wrap-distance-left:9pt;mso-wrap-distance-top:0;mso-wrap-distance-right:9pt;mso-wrap-distance-bottom:0;mso-position-horizontal:absolute;mso-position-horizontal-relative:text;mso-position-vertical:absolute;mso-position-vertical-relative:text" from="-70.1pt,.05pt" to="523.9pt,.05pt" o:gfxdata="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" strokecolor="black [3213]" strokeweight="1.5pt"/>
           </w:pict>
         </mc:Fallback>
       </mc:AlternateContent>
@@ -7869,6 +7937,14 @@
         <w:szCs w:val="36"/>
       </w:rPr>
       <w:tab/>
+    </w:r>
+    <w:r>
+      <w:rPr>
+        <w:b/>
+        <w:bCs/>
+        <w:sz w:val="36"/>
+        <w:szCs w:val="36"/>
+      </w:rPr>
       <w:t xml:space="preserve">PT. </w:t>
     </w:r>
     <w:r>
@@ -7997,7 +8073,7 @@
         </mc:Choice>
         <mc:Fallback>
           <w:pict>
-            <v:line w14:anchorId="47EF5E4E" id="Straight Connector 7" o:spid="_x0000_s1026" style="position:absolute;z-index:487501312;visibility:visible;mso-wrap-style:square;mso-wrap-distance-left:9pt;mso-wrap-distance-top:0;mso-wrap-distance-right:9pt;mso-wrap-distance-bottom:0;mso-position-horizontal:absolute;mso-position-horizontal-relative:text;mso-position-vertical:absolute;mso-position-vertical-relative:text" from="-70.85pt,.05pt" to="523.15pt,.05pt" o:gfxdata="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" strokecolor="black [3213]" strokeweight="1.5pt"/>
+            <v:line w14:anchorId="09D1F001" id="Straight Connector 7" o:spid="_x0000_s1026" style="position:absolute;z-index:487501312;visibility:visible;mso-wrap-style:square;mso-wrap-distance-left:9pt;mso-wrap-distance-top:0;mso-wrap-distance-right:9pt;mso-wrap-distance-bottom:0;mso-position-horizontal:absolute;mso-position-horizontal-relative:text;mso-position-vertical:absolute;mso-position-vertical-relative:text" from="-70.85pt,.05pt" to="523.15pt,.05pt" o:gfxdata="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" strokecolor="black [3213]" strokeweight="1.5pt"/>
           </w:pict>
         </mc:Fallback>
       </mc:AlternateContent>

</xml_diff>